<commit_message>
remove double_stall and stall_counter
</commit_message>
<xml_diff>
--- a/book/finalproject/Final_Project_Assignment_Stage4.docx
+++ b/book/finalproject/Final_Project_Assignment_Stage4.docx
@@ -1650,18 +1650,6 @@
           <w:shd w:val="clear" w:color="auto" w:fill="FFFFFF"/>
         </w:rPr>
       </w:pPr>
-    </w:p>
-    <w:p>
-      <w:pPr>
-        <w:spacing w:after="0" w:line="240" w:lineRule="auto"/>
-        <w:rPr>
-          <w:rFonts w:ascii="Helvetica" w:eastAsia="Times New Roman" w:hAnsi="Helvetica" w:cs="Helvetica"/>
-          <w:color w:val="333333"/>
-          <w:sz w:val="21"/>
-          <w:szCs w:val="21"/>
-          <w:shd w:val="clear" w:color="auto" w:fill="FFFFFF"/>
-        </w:rPr>
-      </w:pPr>
       <w:r>
         <w:rPr>
           <w:rFonts w:ascii="Helvetica" w:eastAsia="Times New Roman" w:hAnsi="Helvetica" w:cs="Helvetica"/>
@@ -1671,10 +1659,10 @@
           <w:shd w:val="clear" w:color="auto" w:fill="FFFFFF"/>
         </w:rPr>
         <w:drawing>
-          <wp:inline distT="0" distB="0" distL="0" distR="0" wp14:anchorId="61B9E529" wp14:editId="3A7B11A0">
-            <wp:extent cx="5943600" cy="3503930"/>
-            <wp:effectExtent l="0" t="0" r="0" b="1270"/>
-            <wp:docPr id="2060137450" name="Picture 1"/>
+          <wp:inline distT="0" distB="0" distL="0" distR="0" wp14:anchorId="3DF5E9EF" wp14:editId="572124AE">
+            <wp:extent cx="5943600" cy="3436620"/>
+            <wp:effectExtent l="0" t="0" r="0" b="0"/>
+            <wp:docPr id="1881195435" name="Picture 1"/>
             <wp:cNvGraphicFramePr>
               <a:graphicFrameLocks xmlns:a="http://schemas.openxmlformats.org/drawingml/2006/main" noChangeAspect="1"/>
             </wp:cNvGraphicFramePr>
@@ -1682,7 +1670,7 @@
               <a:graphicData uri="http://schemas.openxmlformats.org/drawingml/2006/picture">
                 <pic:pic xmlns:pic="http://schemas.openxmlformats.org/drawingml/2006/picture">
                   <pic:nvPicPr>
-                    <pic:cNvPr id="2060137450" name=""/>
+                    <pic:cNvPr id="1881195435" name=""/>
                     <pic:cNvPicPr/>
                   </pic:nvPicPr>
                   <pic:blipFill>
@@ -1694,7 +1682,7 @@
                   <pic:spPr>
                     <a:xfrm>
                       <a:off x="0" y="0"/>
-                      <a:ext cx="5943600" cy="3503930"/>
+                      <a:ext cx="5943600" cy="3436620"/>
                     </a:xfrm>
                     <a:prstGeom prst="rect">
                       <a:avLst/>
@@ -1706,6 +1694,18 @@
           </wp:inline>
         </w:drawing>
       </w:r>
+    </w:p>
+    <w:p>
+      <w:pPr>
+        <w:spacing w:after="0" w:line="240" w:lineRule="auto"/>
+        <w:rPr>
+          <w:rFonts w:ascii="Helvetica" w:eastAsia="Times New Roman" w:hAnsi="Helvetica" w:cs="Helvetica"/>
+          <w:color w:val="333333"/>
+          <w:sz w:val="21"/>
+          <w:szCs w:val="21"/>
+          <w:shd w:val="clear" w:color="auto" w:fill="FFFFFF"/>
+        </w:rPr>
+      </w:pPr>
     </w:p>
     <w:p>
       <w:pPr>

</xml_diff>